<commit_message>
KIT-043 audit remediation: 9 findings closed; render check rerun on the installed repair (c78bd4af), check at baseline, install kit_043 replaced (AuaIVL); bindings regenerated; outcome and remediation record
</commit_message>
<xml_diff>
--- a/docs/qa/workflow-execution/kit/kit-043/LFQ_report-with-record.docx
+++ b/docs/qa/workflow-execution/kit/kit-043/LFQ_report-with-record.docx
@@ -7,7 +7,7 @@
         <w:pStyle w:val="Title"/>
       </w:pPr>
       <w:r>
-        <w:t xml:space="preserve">LFQ Proteomics Analysis for maxquant - report - created on 2026-10-20 13:49:19</w:t>
+        <w:t xml:space="preserve">LFQ Proteomics Analysis for maxquant - report - created on 2026-10-20 14:32:08</w:t>
       </w:r>
     </w:p>
     <w:p>
@@ -622,13 +622,13 @@
         <w:br/>
       </w:r>
       <w:r>
-        <w:t xml:space="preserve">Source commit: a918b5bbc324c62c2c353b753ca62b96b556d731</w:t>
-      </w:r>
-      <w:r>
-        <w:br/>
-      </w:r>
-      <w:r>
-        <w:t xml:space="preserve">Build: 414bf521ab364e82ca54b64432b159dadbbf86d07b8acbd34bb6701e53d1a96e</w:t>
+        <w:t xml:space="preserve">Source commit: c78bd4afee305dd38fbeb51b0d2962e41a20775b</w:t>
+      </w:r>
+      <w:r>
+        <w:br/>
+      </w:r>
+      <w:r>
+        <w:t xml:space="preserve">Build: 7370a43b8b50f7718041d54a84a55a2d4a48e03334bc6ab8ab8c3c71d6ed2f1c</w:t>
       </w:r>
       <w:r>
         <w:br/>

</xml_diff>